<commit_message>
updating CERTREQ responder, complete step 2 of SAINIT
</commit_message>
<xml_diff>
--- a/Document.docx
+++ b/Document.docx
@@ -63,10 +63,7 @@
         <w:ind w:left="720"/>
       </w:pPr>
       <w:r>
-        <w:t xml:space="preserve">b) </w:t>
-      </w:r>
-      <w:r>
-        <w:t xml:space="preserve">Vào properties của Solution trong Solution Explorer -&gt; Common Properties -&gt; Chọn multiple startup projects, chọn chạy 2 project Initiator và Responder (Chế độ Start)  </w:t>
+        <w:t xml:space="preserve">b) Vào properties của Solution trong Solution Explorer -&gt; Common Properties -&gt; Chọn multiple startup projects, chọn chạy 2 project Initiator và Responder (Chế độ Start)  </w:t>
       </w:r>
     </w:p>
     <w:p>
@@ -125,7 +122,15 @@
         <w:ind w:firstLine="720"/>
       </w:pPr>
       <w:r>
-        <w:t>- Việc tiếp theo: Thiết kế struct SA payload, CERTREQ payload. Phương thức build, parse cho SA payload và CERTREQ payload</w:t>
+        <w:t xml:space="preserve">- 21/2: Hoàn thành CERTREQ payload bên Responder, Initiator đã lấy được Identifier </w:t>
+      </w:r>
+    </w:p>
+    <w:p>
+      <w:pPr>
+        <w:ind w:firstLine="720"/>
+      </w:pPr>
+      <w:r>
+        <w:t>- Việc tiếp theo: Thiết kế struct SA payload. Phương thức build, parse cho SA payload</w:t>
       </w:r>
       <w:r>
         <w:t xml:space="preserve">. Hoàn thành đầy đủ 2 bước bắt tay đầu tiên của SA INIT </w:t>

</xml_diff>

<commit_message>
refactoring for 2nd milestone
</commit_message>
<xml_diff>
--- a/Document.docx
+++ b/Document.docx
@@ -23,7 +23,13 @@
         </w:numPr>
       </w:pPr>
       <w:r>
-        <w:t xml:space="preserve">Demo IKEv2 thông qua socket loopback, sử dụng thư viện Openssl 3.4 (dành cho certificate), Crypto++ (dành cho việc sinh số ngẫu nhiên, mã hóa, chứng thực). Winsock để kết nối socket. </w:t>
+        <w:t>Demo IKEv2</w:t>
+      </w:r>
+      <w:r>
+        <w:t xml:space="preserve"> SA INIT và AUTH</w:t>
+      </w:r>
+      <w:r>
+        <w:t xml:space="preserve"> thông qua socket loopback, sử dụng thư viện Openssl 3.4 (dành cho certificate), Crypto++ (dành cho việc sinh số ngẫu nhiên, mã hóa, chứng thực). Winsock để kết nối socket. </w:t>
       </w:r>
     </w:p>
     <w:p>
@@ -35,7 +41,7 @@
         </w:numPr>
       </w:pPr>
       <w:r>
-        <w:t xml:space="preserve">Việc demo này  chủ yếu là in ra các gói tin và thông tin ở cả 2 bên, liên tục tuyến tính (không có menu cho user), bấm một phát là demo hết.  Nhóm sẽ dùng bộ mã khuyến nghị GCM-128 để cài đặt. </w:t>
+        <w:t xml:space="preserve">Việc demo này  chủ yếu là in ra các gói tin và thông tin ở cả 2 bên, liên tục tuyến tính (không có menu cho user), bấm một phát là demo hết.  </w:t>
       </w:r>
     </w:p>
     <w:p>
@@ -67,16 +73,16 @@
       </w:r>
     </w:p>
     <w:p>
-      <w:pPr>
-        <w:ind w:left="720"/>
-      </w:pPr>
-      <w:r>
-        <w:t xml:space="preserve">c) Khi push code lên github, xóa thư mục Output (thư mục sinh ra sau khi build cryptlib) </w:t>
+      <w:r>
+        <w:t xml:space="preserve">       3) Tracking logs </w:t>
       </w:r>
     </w:p>
     <w:p>
-      <w:r>
-        <w:t xml:space="preserve">       3) Tracking logs </w:t>
+      <w:pPr>
+        <w:ind w:firstLine="720"/>
+      </w:pPr>
+      <w:r>
+        <w:t xml:space="preserve">- 14/2: Kết nối socket giữa Initiator và Responder, gửi tin nhắn dạng text với nhau. </w:t>
       </w:r>
     </w:p>
     <w:p>
@@ -84,7 +90,10 @@
         <w:ind w:firstLine="720"/>
       </w:pPr>
       <w:r>
-        <w:t xml:space="preserve">- 14/2: Kết nối socket giữa Initiator và Responder, gửi tin nhắn dạng text với nhau. </w:t>
+        <w:t>- 17/2: Cài đặt được sơ khai gói tin IKEMessage (gồm 1 header và nhiều payloads), gửi publickey và nonce của Initiator tới Responder</w:t>
+      </w:r>
+      <w:r>
+        <w:t>.</w:t>
       </w:r>
     </w:p>
     <w:p>
@@ -92,7 +101,10 @@
         <w:ind w:firstLine="720"/>
       </w:pPr>
       <w:r>
-        <w:t xml:space="preserve">Cài SA INIT: </w:t>
+        <w:t>- 19/2: Cài đặt được tính khóa chung (shared secret) cả 2 bên, Responder gửi nonce và publickey về Initiator</w:t>
+      </w:r>
+      <w:r>
+        <w:t xml:space="preserve">. </w:t>
       </w:r>
     </w:p>
     <w:p>
@@ -100,10 +112,7 @@
         <w:ind w:firstLine="720"/>
       </w:pPr>
       <w:r>
-        <w:t>- 17/2: Cài đặt được sơ khai gói tin IKEMessage (gồm 1 header và nhiều payloads), gửi publickey và nonce của Initiator tới Responder</w:t>
-      </w:r>
-      <w:r>
-        <w:t>.</w:t>
+        <w:t xml:space="preserve">- 21/2: Hoàn thành CERTREQ payload bên Responder, Initiator đã lấy được Identifier </w:t>
       </w:r>
     </w:p>
     <w:p>
@@ -111,42 +120,13 @@
         <w:ind w:firstLine="720"/>
       </w:pPr>
       <w:r>
-        <w:t>- 19/2: Cài đặt được tính khóa chung (shared secret) cả 2 bên, Responder gửi nonce và publickey về Initiator</w:t>
-      </w:r>
-      <w:r>
-        <w:t xml:space="preserve">. </w:t>
+        <w:t>- 27/2: Tính được khóa Skeyseed</w:t>
       </w:r>
     </w:p>
     <w:p>
-      <w:pPr>
-        <w:ind w:firstLine="720"/>
-      </w:pPr>
-      <w:r>
-        <w:t xml:space="preserve">- 21/2: Hoàn thành CERTREQ payload bên Responder, Initiator đã lấy được Identifier </w:t>
-      </w:r>
-    </w:p>
-    <w:p>
-      <w:pPr>
-        <w:ind w:firstLine="720"/>
-      </w:pPr>
-      <w:r>
-        <w:t>- 27/2: Tính được khóa Skeyseed</w:t>
-      </w:r>
-    </w:p>
-    <w:p>
-      <w:pPr>
-        <w:ind w:firstLine="720"/>
-      </w:pPr>
-      <w:r>
-        <w:t>- Việc tiếp theo: Thiết kế struct SA payload. Phương thức build, parse cho SA payload</w:t>
-      </w:r>
-      <w:r>
-        <w:t xml:space="preserve">. Hoàn thành đầy đủ 2 bước bắt tay đầu tiên của SA INIT </w:t>
-      </w:r>
-    </w:p>
-    <w:p>
-      <w:r>
-        <w:t xml:space="preserve"> </w:t>
+      <w:r>
+        <w:tab/>
+        <w:t xml:space="preserve">- 8/3: Tạo một xích khóa từ Skeyseed và phân rã thành các khóa mã hóa, xác thực cho cả 2 bên thành công </w:t>
       </w:r>
     </w:p>
     <w:p/>

</xml_diff>